<commit_message>
Uskladi dokumentaciju i podesi HTTPS
Change-Id: I5309043e6d73d6d0f581fd22ddf284aad5f85aad
</commit_message>
<xml_diff>
--- a/docs/ScanFlow doc1.docx
+++ b/docs/ScanFlow doc1.docx
@@ -153,15 +153,20 @@
       <w:pPr>
         <w:rPr>
           <w:rFonts w:ascii="Arial" w:hAnsi="Arial" w:cs="Arial"/>
-          <w:lang w:val="sr-Cyrl-RS"/>
-        </w:rPr>
-      </w:pPr>
-      <w:r>
-        <w:rPr>
-          <w:rFonts w:ascii="Arial" w:hAnsi="Arial" w:cs="Arial"/>
-          <w:lang w:val="sr-Cyrl-RS"/>
-        </w:rPr>
-        <w:t>Верзија 1.0</w:t>
+        </w:rPr>
+      </w:pPr>
+      <w:r>
+        <w:rPr>
+          <w:rFonts w:ascii="Arial" w:hAnsi="Arial" w:cs="Arial"/>
+          <w:lang w:val="sr-Cyrl-RS"/>
+        </w:rPr>
+        <w:t>Верзија 1.</w:t>
+      </w:r>
+      <w:r>
+        <w:rPr>
+          <w:rFonts w:ascii="Arial" w:hAnsi="Arial" w:cs="Arial"/>
+        </w:rPr>
+        <w:t>1</w:t>
       </w:r>
     </w:p>
     <w:p>
@@ -1433,7 +1438,35 @@
           <w:i/>
           <w:iCs/>
         </w:rPr>
-        <w:t>html5-qrcode</w:t>
+        <w:t>react-qr-reader</w:t>
+      </w:r>
+      <w:r>
+        <w:rPr>
+          <w:rFonts w:ascii="Arial" w:hAnsi="Arial" w:cs="Arial"/>
+        </w:rPr>
+        <w:t xml:space="preserve"> </w:t>
+      </w:r>
+      <w:r>
+        <w:rPr>
+          <w:rFonts w:ascii="Arial" w:hAnsi="Arial" w:cs="Arial"/>
+          <w:lang w:val="sr-Cyrl-RS"/>
+        </w:rPr>
+        <w:t xml:space="preserve">и </w:t>
+      </w:r>
+      <w:r>
+        <w:rPr>
+          <w:rFonts w:ascii="Arial" w:hAnsi="Arial" w:cs="Arial"/>
+          <w:i/>
+          <w:iCs/>
+        </w:rPr>
+        <w:t>qrcode.react</w:t>
+      </w:r>
+      <w:r>
+        <w:rPr>
+          <w:rFonts w:ascii="Arial" w:hAnsi="Arial" w:cs="Arial"/>
+          <w:lang w:val="sr-Cyrl-RS"/>
+        </w:rPr>
+        <w:t>.</w:t>
       </w:r>
       <w:r>
         <w:rPr>

</xml_diff>